<commit_message>
fix(data): count a creative for every arrival, like the workbook does
워크북 03_소재별성과 는 도착 이벤트마다 소재를 세어, 한 세션에서 두 소재를
거치면 양쪽에 모두 1 로 잡는다. 시트가 스스로 그렇게 적어 두었다 —
"한 사람이 서로 다른 소재의 광고를 각각 클릭해 방문하면 양쪽 소재에 모두
1로 잡힌다." 우리 추출 코드는 세션의 소재를 처음 본 값 하나로 정하고 있어
그런 세션의 두 번째 소재가 사라졌다.

해당 세션은 9,476 개 중 7 개뿐이고 그 7 개에는 CTA·메뉴 이벤트가 하나도
없다. 세션 행을 소재 수만큼 복제하고 복제본에 dup=1 을 달았다. 사람 수는
COUNTD 라 복제해도 그대로이고, 세션 수만 원본 행으로 센다.

  소재  business_taste 4,413 → 4,415 · family_taste 2,027 → 2,028
        family_bday_vid 1,441 → 1,442
  세트  business 4,583 → 4,585 · family 3,557 → 3,559

이제 워크북 7 개 소재와 광고세트 2 개가 전부 일치한다. 헤드라인은 하나도
안 움직였다 — 방문자 8,084 · 세션 9,505 · 행동 150 · CTA 110 · 예약 유도 90.

태블로 CSV 에도 is_dup 을 맨 뒤에 붙였다. 기존 컬럼 이름과 순서는 그대로라
이미 맺어 둔 관계와 계산된 필드가 살아 있다.

분석 문서도 워크북 값으로 되돌렸다(4,415). 앞서 대시보드 값으로 바꾼 것은
잘못이었다. OS 수정(iOS 3,412 · Android 1.56% · iOS 0.53%)은 06_세그먼트
시트와 일치하므로 그대로 둔다.
</commit_message>
<xml_diff>
--- a/docs/데이터분석_웹페이지(앰플리튜드)_수정본.docx
+++ b/docs/데이터분석_웹페이지(앰플리튜드)_수정본.docx
@@ -4550,7 +4550,7 @@
                 <w:highlight w:val="yellow"/>
                 <w:rtl w:val="0"/>
               </w:rPr>
-              <w:t>4,413</w:t>
+              <w:t>4,415</w:t>
             </w:r>
           </w:p>
         </w:tc>
@@ -4786,7 +4786,7 @@
                 <w:highlight w:val="yellow"/>
                 <w:rtl w:val="0"/>
               </w:rPr>
-              <w:t>1,441</w:t>
+              <w:t>1,442</w:t>
             </w:r>
           </w:p>
         </w:tc>
@@ -5022,7 +5022,7 @@
                 <w:highlight w:val="yellow"/>
                 <w:rtl w:val="0"/>
               </w:rPr>
-              <w:t>2,027</w:t>
+              <w:t>2,028</w:t>
             </w:r>
           </w:p>
         </w:tc>
@@ -9068,7 +9068,7 @@
                 <w:szCs w:val="17"/>
                 <w:rtl w:val="0"/>
               </w:rPr>
-              <w:t>4,413</w:t>
+              <w:t>4,415</w:t>
             </w:r>
           </w:p>
         </w:tc>
@@ -9343,7 +9343,7 @@
                 <w:szCs w:val="17"/>
                 <w:rtl w:val="0"/>
               </w:rPr>
-              <w:t>1,441</w:t>
+              <w:t>1,442</w:t>
             </w:r>
           </w:p>
         </w:tc>
@@ -9615,7 +9615,7 @@
                 <w:szCs w:val="17"/>
                 <w:rtl w:val="0"/>
               </w:rPr>
-              <w:t>2,027</w:t>
+              <w:t>2,028</w:t>
             </w:r>
           </w:p>
         </w:tc>
@@ -10191,7 +10191,7 @@
           <w:rFonts w:ascii="Arial Unicode MS" w:cs="Arial Unicode MS" w:eastAsia="Arial Unicode MS" w:hAnsi="Arial Unicode MS"/>
           <w:rtl w:val="0"/>
         </w:rPr>
-        <w:t>family_taste는 링크클릭 4,197로 클릭 2위였고 랜딩에도 2,027명이 도착했다. 그런데 예약 버튼을 누른 사람은 11명, 세 소재 중 꼴찌다. 유도율 0.54%로 business_taste(1.45%)의 37% 수준이다.</w:t>
+        <w:t>family_taste는 링크클릭 4,197로 클릭 2위였고 랜딩에도 2,028명이 도착했다. 그런데 예약 버튼을 누른 사람은 11명, 세 소재 중 꼴찌다. 유도율 0.54%로 business_taste(1.45%)의 37% 수준이다.</w:t>
       </w:r>
     </w:p>
     <w:tbl>
@@ -11360,7 +11360,7 @@
           <w:rFonts w:ascii="Arial Unicode MS" w:cs="Arial Unicode MS" w:eastAsia="Arial Unicode MS" w:hAnsi="Arial Unicode MS"/>
           <w:rtl w:val="0"/>
         </w:rPr>
-        <w:t>예산이 가장 적었고(₫1.5M) 방문도 가장 적다(1,441명). 그런데 유도율은 0.83%로 2위이고, 유도당 비용도 ₫124,832로 family_taste(₫238,690)의 절반 수준이다. 예산이 적어 노출이 제한된 상태에서 나온 성과라 증액 시 효율 유지 여부는 알 수 없다 — 예산을 뺄 대상이 아니라 검증할 대상이다.</w:t>
+        <w:t>예산이 가장 적었고(₫1.5M) 방문도 가장 적다(1,442명). 그런데 유도율은 0.83%로 2위이고, 유도당 비용도 ₫124,832로 family_taste(₫238,690)의 절반 수준이다. 예산이 적어 노출이 제한된 상태에서 나온 성과라 증액 시 효율 유지 여부는 알 수 없다 — 예산을 뺄 대상이 아니라 검증할 대상이다.</w:t>
       </w:r>
     </w:p>
     <w:p>
@@ -11593,7 +11593,7 @@
           <w:szCs w:val="17"/>
           <w:rtl w:val="0"/>
         </w:rPr>
-        <w:t>· 전체 유도율 1.11%는 고유 방문자 8,084명 기준이다. 소재별 방문 합계(8,211)는 여러 소재로 재유입한 사용자가 중복 계산되므로 총계 분모로 쓰지 않는다.</w:t>
+        <w:t>· 전체 유도율 1.11%는 고유 방문자 8,084명 기준이다. 소재별 방문 합계(8,217)는 여러 소재로 재유입한 사용자가 중복 계산되므로 총계 분모로 쓰지 않는다.</w:t>
       </w:r>
     </w:p>
     <w:p>

</xml_diff>